<commit_message>
DIO Design Doc V1
</commit_message>
<xml_diff>
--- a/docs/DIO Module Design Doc.docx
+++ b/docs/DIO Module Design Doc.docx
@@ -5,6 +5,119 @@
     <w:p>
       <w:pPr>
         <w:pStyle w:val="Heading1"/>
+      </w:pPr>
+      <w:r>
+        <w:t>Hardware Overview:</w:t>
+      </w:r>
+    </w:p>
+    <w:p>
+      <w:pPr>
+        <w:pStyle w:val="NoSpacing"/>
+      </w:pPr>
+      <w:r>
+        <w:br/>
+        <w:t>- Output: 2 x 8-bit serial-in parallel-out shift registers (daisy chained)</w:t>
+      </w:r>
+      <w:r>
+        <w:t xml:space="preserve"> 74HC595N</w:t>
+      </w:r>
+      <w:r>
+        <w:br/>
+        <w:t>- Input: 2 x 8-bit parallel-in serial-out shift registers</w:t>
+      </w:r>
+      <w:r>
+        <w:t xml:space="preserve"> 74HC165N</w:t>
+      </w:r>
+      <w:r>
+        <w:br/>
+        <w:t>- Interface: SPI (shared)</w:t>
+      </w:r>
+      <w:r>
+        <w:br/>
+        <w:t>- Control Pins:</w:t>
+      </w:r>
+      <w:r>
+        <w:br/>
+        <w:t>- LATCH_OUT (for outputs)</w:t>
+      </w:r>
+      <w:r>
+        <w:br/>
+        <w:t>- LOAD_IN (for inputs)</w:t>
+      </w:r>
+    </w:p>
+    <w:p>
+      <w:pPr>
+        <w:pStyle w:val="NoSpacing"/>
+      </w:pPr>
+    </w:p>
+    <w:p>
+      <w:pPr>
+        <w:pStyle w:val="NoSpacing"/>
+      </w:pPr>
+      <w:r>
+        <w:t>In Daisy Chaining first 8 bits go to the last register, So SPI order must match hardware wiring.</w:t>
+      </w:r>
+    </w:p>
+    <w:p>
+      <w:pPr>
+        <w:pStyle w:val="NoSpacing"/>
+      </w:pPr>
+    </w:p>
+    <w:p>
+      <w:pPr>
+        <w:pStyle w:val="NoSpacing"/>
+        <w:rPr>
+          <w:lang w:val="en-US"/>
+        </w:rPr>
+      </w:pPr>
+      <w:r>
+        <w:t>Application</w:t>
+      </w:r>
+      <w:r>
+        <w:br/>
+        <w:t>↓</w:t>
+      </w:r>
+      <w:r>
+        <w:br/>
+        <w:t>DIO (what user wants)</w:t>
+      </w:r>
+      <w:r>
+        <w:t xml:space="preserve"> (Layer2: Exposed to Application and implements State maintenance)</w:t>
+      </w:r>
+      <w:r>
+        <w:br/>
+        <w:t>↓</w:t>
+      </w:r>
+      <w:r>
+        <w:br/>
+        <w:t>Shift Register Layer (how hardware works)</w:t>
+      </w:r>
+      <w:r>
+        <w:t xml:space="preserve"> (Layer1: Gives input/output API implementations for shift register’s perspective)</w:t>
+      </w:r>
+      <w:r>
+        <w:br/>
+        <w:t>↓</w:t>
+      </w:r>
+      <w:r>
+        <w:br/>
+        <w:t>SPI + GPIO</w:t>
+      </w:r>
+      <w:r>
+        <w:t xml:space="preserve">  (Layer 0: Already written in </w:t>
+      </w:r>
+      <w:proofErr w:type="spellStart"/>
+      <w:r>
+        <w:t>SimpleLink</w:t>
+      </w:r>
+      <w:proofErr w:type="spellEnd"/>
+      <w:r>
+        <w:t xml:space="preserve"> SDK)</w:t>
+      </w:r>
+    </w:p>
+    <w:p>
+      <w:pPr>
+        <w:pStyle w:val="Heading1"/>
         <w:rPr>
           <w:lang w:val="en-US"/>
         </w:rPr>
@@ -70,14 +183,7 @@
         <w:rPr>
           <w:lang w:val="en-US"/>
         </w:rPr>
-        <w:t>DOUT_</w:t>
-      </w:r>
-      <w:proofErr w:type="gramStart"/>
-      <w:r>
-        <w:rPr>
-          <w:lang w:val="en-US"/>
-        </w:rPr>
-        <w:t>Pins</w:t>
+        <w:t>DOUT_Pins</w:t>
       </w:r>
       <w:proofErr w:type="spellEnd"/>
       <w:r>
@@ -86,7 +192,6 @@
         </w:rPr>
         <w:t>{</w:t>
       </w:r>
-      <w:proofErr w:type="gramEnd"/>
     </w:p>
     <w:p>
       <w:pPr>
@@ -631,6 +736,12 @@
         </w:rPr>
         <w:t>}</w:t>
       </w:r>
+      <w:r>
+        <w:rPr>
+          <w:lang w:val="en-US"/>
+        </w:rPr>
+        <w:t xml:space="preserve"> // Assuming this mapping for now, might need alignment with actual pins later as per HW design</w:t>
+      </w:r>
     </w:p>
     <w:p>
       <w:pPr>
@@ -652,14 +763,8 @@
         <w:rPr>
           <w:lang w:val="en-US"/>
         </w:rPr>
-        <w:t>DIN_</w:t>
-      </w:r>
-      <w:proofErr w:type="gramStart"/>
-      <w:r>
-        <w:rPr>
-          <w:lang w:val="en-US"/>
-        </w:rPr>
-        <w:t>Pins</w:t>
+        <w:lastRenderedPageBreak/>
+        <w:t>DIN_Pins</w:t>
       </w:r>
       <w:proofErr w:type="spellEnd"/>
       <w:r>
@@ -668,7 +773,6 @@
         </w:rPr>
         <w:t>{</w:t>
       </w:r>
-      <w:proofErr w:type="gramEnd"/>
     </w:p>
     <w:p>
       <w:pPr>
@@ -1099,846 +1203,784 @@
         </w:rPr>
         <w:t>}</w:t>
       </w:r>
-    </w:p>
-    <w:p>
-      <w:pPr>
-        <w:rPr>
-          <w:lang w:val="en-US"/>
-        </w:rPr>
-      </w:pPr>
-    </w:p>
-    <w:p>
-      <w:pPr>
-        <w:pStyle w:val="Heading2"/>
-        <w:rPr>
-          <w:lang w:val="en-US"/>
-        </w:rPr>
-      </w:pPr>
+      <w:r>
+        <w:rPr>
+          <w:lang w:val="en-US"/>
+        </w:rPr>
+        <w:t xml:space="preserve"> </w:t>
+      </w:r>
+      <w:r>
+        <w:rPr>
+          <w:lang w:val="en-US"/>
+        </w:rPr>
+        <w:t>// Assuming this mapping for now, might need alignment with actual pins later as per HW design</w:t>
+      </w:r>
+    </w:p>
+    <w:p>
+      <w:pPr>
+        <w:rPr>
+          <w:lang w:val="en-US"/>
+        </w:rPr>
+      </w:pPr>
+    </w:p>
+    <w:p>
+      <w:pPr>
+        <w:pStyle w:val="NoSpacing"/>
+        <w:rPr>
+          <w:lang w:val="en-US"/>
+        </w:rPr>
+      </w:pPr>
+      <w:r>
+        <w:rPr>
+          <w:lang w:val="en-US"/>
+        </w:rPr>
+        <w:t>typedef struct{</w:t>
+      </w:r>
+    </w:p>
+    <w:p>
+      <w:pPr>
+        <w:pStyle w:val="NoSpacing"/>
+        <w:rPr>
+          <w:lang w:val="en-US"/>
+        </w:rPr>
+      </w:pPr>
+      <w:r>
+        <w:rPr>
+          <w:lang w:val="en-US"/>
+        </w:rPr>
+        <w:t xml:space="preserve">   </w:t>
+      </w:r>
       <w:proofErr w:type="spellStart"/>
       <w:r>
         <w:rPr>
           <w:lang w:val="en-US"/>
         </w:rPr>
-        <w:lastRenderedPageBreak/>
-        <w:t>DIO_</w:t>
-      </w:r>
-      <w:proofErr w:type="gramStart"/>
-      <w:r>
-        <w:rPr>
-          <w:lang w:val="en-US"/>
-        </w:rPr>
-        <w:t>Handle</w:t>
+        <w:t>SPI_Handle</w:t>
       </w:r>
       <w:proofErr w:type="spellEnd"/>
       <w:r>
         <w:rPr>
           <w:lang w:val="en-US"/>
         </w:rPr>
-        <w:t>{</w:t>
-      </w:r>
-      <w:proofErr w:type="gramEnd"/>
-    </w:p>
-    <w:p>
-      <w:pPr>
-        <w:pStyle w:val="NoSpacing"/>
-        <w:rPr>
-          <w:lang w:val="en-US"/>
-        </w:rPr>
-      </w:pPr>
-      <w:r>
-        <w:rPr>
-          <w:lang w:val="en-US"/>
-        </w:rPr>
-        <w:t>uint16_t buffer; // To hold the pin configuration requests</w:t>
-      </w:r>
-    </w:p>
-    <w:p>
-      <w:pPr>
-        <w:pStyle w:val="NoSpacing"/>
-        <w:rPr>
-          <w:lang w:val="en-US"/>
-        </w:rPr>
-      </w:pPr>
-      <w:r>
-        <w:rPr>
-          <w:lang w:val="en-US"/>
-        </w:rPr>
+        <w:t xml:space="preserve"> handle;</w:t>
+      </w:r>
+    </w:p>
+    <w:p>
+      <w:pPr>
+        <w:pStyle w:val="NoSpacing"/>
+        <w:rPr>
+          <w:lang w:val="en-US"/>
+        </w:rPr>
+      </w:pPr>
+      <w:r>
+        <w:rPr>
+          <w:lang w:val="en-US"/>
+        </w:rPr>
+        <w:t xml:space="preserve">   </w:t>
+      </w:r>
+      <w:proofErr w:type="spellStart"/>
+      <w:r>
+        <w:rPr>
+          <w:lang w:val="en-US"/>
+        </w:rPr>
+        <w:t>GPIO_Pin</w:t>
+      </w:r>
+      <w:proofErr w:type="spellEnd"/>
+      <w:r>
+        <w:rPr>
+          <w:lang w:val="en-US"/>
+        </w:rPr>
+        <w:t xml:space="preserve"> </w:t>
+      </w:r>
+      <w:proofErr w:type="spellStart"/>
+      <w:r>
+        <w:rPr>
+          <w:lang w:val="en-US"/>
+        </w:rPr>
+        <w:t>latchPin</w:t>
+      </w:r>
+      <w:proofErr w:type="spellEnd"/>
+      <w:r>
+        <w:rPr>
+          <w:lang w:val="en-US"/>
+        </w:rPr>
+        <w:t>;</w:t>
+      </w:r>
+    </w:p>
+    <w:p>
+      <w:pPr>
+        <w:pStyle w:val="NoSpacing"/>
+        <w:rPr>
+          <w:lang w:val="en-US"/>
+        </w:rPr>
+      </w:pPr>
+      <w:r>
+        <w:rPr>
+          <w:lang w:val="en-US"/>
+        </w:rPr>
+        <w:t xml:space="preserve">   </w:t>
+      </w:r>
+      <w:proofErr w:type="spellStart"/>
+      <w:r>
+        <w:rPr>
+          <w:lang w:val="en-US"/>
+        </w:rPr>
+        <w:t>GPIO_Pin</w:t>
+      </w:r>
+      <w:proofErr w:type="spellEnd"/>
+      <w:r>
+        <w:rPr>
+          <w:lang w:val="en-US"/>
+        </w:rPr>
+        <w:t xml:space="preserve"> </w:t>
+      </w:r>
+      <w:proofErr w:type="spellStart"/>
+      <w:r>
+        <w:rPr>
+          <w:lang w:val="en-US"/>
+        </w:rPr>
+        <w:t>loadPin</w:t>
+      </w:r>
+      <w:proofErr w:type="spellEnd"/>
+      <w:r>
+        <w:rPr>
+          <w:lang w:val="en-US"/>
+        </w:rPr>
+        <w:t>;</w:t>
+      </w:r>
+    </w:p>
+    <w:p>
+      <w:pPr>
+        <w:pStyle w:val="NoSpacing"/>
+      </w:pPr>
+      <w:r>
+        <w:t>}</w:t>
+      </w:r>
+      <w:proofErr w:type="spellStart"/>
+      <w:r>
+        <w:t>SR_Config</w:t>
+      </w:r>
+      <w:proofErr w:type="spellEnd"/>
+      <w:r>
+        <w:t xml:space="preserve">;   // Will reside inside </w:t>
+      </w:r>
+      <w:proofErr w:type="spellStart"/>
+      <w:r>
+        <w:t>shift_register</w:t>
+      </w:r>
+      <w:proofErr w:type="spellEnd"/>
+      <w:r>
+        <w:t xml:space="preserve"> layer to implement shifting logic</w:t>
+      </w:r>
+    </w:p>
+    <w:p>
+      <w:pPr>
+        <w:pStyle w:val="NoSpacing"/>
+        <w:rPr>
+          <w:lang w:val="en-US"/>
+        </w:rPr>
+      </w:pPr>
+    </w:p>
+    <w:p>
+      <w:pPr>
+        <w:pStyle w:val="NoSpacing"/>
+      </w:pPr>
+      <w:r>
+        <w:t>typedef struct {</w:t>
+      </w:r>
+    </w:p>
+    <w:p>
+      <w:pPr>
+        <w:pStyle w:val="NoSpacing"/>
+      </w:pPr>
+      <w:r>
+        <w:t xml:space="preserve">    </w:t>
+      </w:r>
+      <w:proofErr w:type="spellStart"/>
+      <w:r>
+        <w:t>SR_config</w:t>
+      </w:r>
+      <w:proofErr w:type="spellEnd"/>
+      <w:r>
+        <w:t xml:space="preserve"> config;</w:t>
+      </w:r>
+    </w:p>
+    <w:p>
+      <w:pPr>
+        <w:pStyle w:val="NoSpacing"/>
+      </w:pPr>
+      <w:r>
+        <w:t xml:space="preserve">    uint16_t </w:t>
+      </w:r>
+      <w:proofErr w:type="spellStart"/>
+      <w:r>
+        <w:t>outShadow</w:t>
+      </w:r>
+      <w:proofErr w:type="spellEnd"/>
+      <w:r>
+        <w:t>;   // What user wants</w:t>
+      </w:r>
+    </w:p>
+    <w:p>
+      <w:pPr>
+        <w:pStyle w:val="NoSpacing"/>
+      </w:pPr>
+      <w:r>
+        <w:t xml:space="preserve">    uint16_t </w:t>
+      </w:r>
+      <w:proofErr w:type="spellStart"/>
+      <w:r>
+        <w:t>outLatched</w:t>
+      </w:r>
+      <w:proofErr w:type="spellEnd"/>
+      <w:r>
+        <w:t>;  // What is actually written to HW</w:t>
+      </w:r>
+    </w:p>
+    <w:p>
+      <w:pPr>
+        <w:pStyle w:val="NoSpacing"/>
+      </w:pPr>
+      <w:r>
+        <w:t xml:space="preserve">    uint16_t </w:t>
+      </w:r>
+      <w:proofErr w:type="spellStart"/>
+      <w:r>
+        <w:t>inRaw</w:t>
+      </w:r>
+      <w:proofErr w:type="spellEnd"/>
+      <w:r>
+        <w:t>;       // Last read from HW</w:t>
+      </w:r>
+    </w:p>
+    <w:p>
+      <w:pPr>
+        <w:pStyle w:val="NoSpacing"/>
+      </w:pPr>
+      <w:r>
+        <w:t xml:space="preserve">} </w:t>
+      </w:r>
+      <w:proofErr w:type="spellStart"/>
+      <w:r>
+        <w:t>DIO_Handle</w:t>
+      </w:r>
+      <w:proofErr w:type="spellEnd"/>
+      <w:r>
+        <w:t>;</w:t>
+      </w:r>
+    </w:p>
+    <w:p>
+      <w:pPr>
+        <w:pStyle w:val="Heading1"/>
+        <w:rPr>
+          <w:lang w:val="en-US"/>
+        </w:rPr>
+      </w:pPr>
+      <w:r>
+        <w:rPr>
+          <w:lang w:val="en-US"/>
+        </w:rPr>
+        <w:t>APIs</w:t>
+      </w:r>
+    </w:p>
+    <w:p>
+      <w:pPr>
+        <w:pStyle w:val="NoSpacing"/>
+        <w:rPr>
+          <w:lang w:val="en-US"/>
+        </w:rPr>
+      </w:pPr>
+      <w:r>
+        <w:rPr>
+          <w:lang w:val="en-US"/>
+        </w:rPr>
+        <w:t>/******************************</w:t>
+      </w:r>
+    </w:p>
+    <w:p>
+      <w:pPr>
+        <w:pStyle w:val="NoSpacing"/>
+        <w:rPr>
+          <w:lang w:val="en-US"/>
+        </w:rPr>
+      </w:pPr>
+      <w:r>
+        <w:rPr>
+          <w:lang w:val="en-US"/>
+        </w:rPr>
+        <w:t xml:space="preserve">* </w:t>
+      </w:r>
+      <w:r>
+        <w:rPr>
+          <w:lang w:val="en-US"/>
+        </w:rPr>
+        <w:t>initializes connections and returns handle with default values of handle arguments</w:t>
+      </w:r>
+    </w:p>
+    <w:p>
+      <w:pPr>
+        <w:pStyle w:val="NoSpacing"/>
+        <w:rPr>
+          <w:lang w:val="en-US"/>
+        </w:rPr>
+      </w:pPr>
+      <w:r>
+        <w:rPr>
+          <w:lang w:val="en-US"/>
+        </w:rPr>
+        <w:t>******************************/</w:t>
+      </w:r>
+    </w:p>
+    <w:p>
+      <w:pPr>
+        <w:pStyle w:val="NoSpacing"/>
+        <w:rPr>
+          <w:lang w:val="en-US"/>
+        </w:rPr>
+      </w:pPr>
+      <w:proofErr w:type="spellStart"/>
+      <w:r>
+        <w:rPr>
+          <w:lang w:val="en-US"/>
+        </w:rPr>
+        <w:t>DIO_Handle</w:t>
+      </w:r>
+      <w:proofErr w:type="spellEnd"/>
+      <w:r>
+        <w:rPr>
+          <w:lang w:val="en-US"/>
+        </w:rPr>
+        <w:t xml:space="preserve"> </w:t>
+      </w:r>
+      <w:proofErr w:type="spellStart"/>
+      <w:r>
+        <w:rPr>
+          <w:lang w:val="en-US"/>
+        </w:rPr>
+        <w:t>DIO_init</w:t>
+      </w:r>
+      <w:proofErr w:type="spellEnd"/>
+      <w:r>
+        <w:rPr>
+          <w:lang w:val="en-US"/>
+        </w:rPr>
+        <w:t>(void)</w:t>
+      </w:r>
+    </w:p>
+    <w:p>
+      <w:pPr>
+        <w:pStyle w:val="NoSpacing"/>
+        <w:rPr>
+          <w:lang w:val="en-US"/>
+        </w:rPr>
+      </w:pPr>
+    </w:p>
+    <w:p>
+      <w:pPr>
+        <w:pStyle w:val="NoSpacing"/>
+        <w:rPr>
+          <w:lang w:val="en-US"/>
+        </w:rPr>
+      </w:pPr>
+    </w:p>
+    <w:p>
+      <w:pPr>
+        <w:pStyle w:val="NoSpacing"/>
+        <w:rPr>
+          <w:lang w:val="en-US"/>
+        </w:rPr>
+      </w:pPr>
+      <w:r>
+        <w:rPr>
+          <w:lang w:val="en-US"/>
+        </w:rPr>
+        <w:t>/******************************</w:t>
+      </w:r>
+    </w:p>
+    <w:p>
+      <w:pPr>
+        <w:pStyle w:val="NoSpacing"/>
+        <w:rPr>
+          <w:lang w:val="en-US"/>
+        </w:rPr>
+      </w:pPr>
+      <w:r>
+        <w:rPr>
+          <w:lang w:val="en-US"/>
+        </w:rPr>
+        <w:t xml:space="preserve">* </w:t>
+      </w:r>
+      <w:r>
+        <w:rPr>
+          <w:lang w:val="en-US"/>
+        </w:rPr>
+        <w:t>Collects intended level of an out pin</w:t>
+      </w:r>
+    </w:p>
+    <w:p>
+      <w:pPr>
+        <w:pStyle w:val="NoSpacing"/>
+        <w:rPr>
+          <w:lang w:val="en-US"/>
+        </w:rPr>
+      </w:pPr>
+      <w:r>
+        <w:rPr>
+          <w:lang w:val="en-US"/>
+        </w:rPr>
+        <w:t>******************************/</w:t>
+      </w:r>
+    </w:p>
+    <w:p>
+      <w:pPr>
+        <w:pStyle w:val="NoSpacing"/>
+        <w:rPr>
+          <w:lang w:val="en-US"/>
+        </w:rPr>
+      </w:pPr>
+      <w:r>
+        <w:rPr>
+          <w:lang w:val="en-US"/>
+        </w:rPr>
+        <w:t xml:space="preserve">void </w:t>
+      </w:r>
+      <w:proofErr w:type="spellStart"/>
+      <w:r>
+        <w:rPr>
+          <w:lang w:val="en-US"/>
+        </w:rPr>
+        <w:t>DIO_writePin</w:t>
+      </w:r>
+      <w:proofErr w:type="spellEnd"/>
+      <w:r>
+        <w:rPr>
+          <w:lang w:val="en-US"/>
+        </w:rPr>
+        <w:t>(</w:t>
+      </w:r>
+      <w:proofErr w:type="spellStart"/>
+      <w:r>
+        <w:rPr>
+          <w:lang w:val="en-US"/>
+        </w:rPr>
+        <w:t>DIO_Handle</w:t>
+      </w:r>
+      <w:proofErr w:type="spellEnd"/>
+      <w:r>
+        <w:rPr>
+          <w:lang w:val="en-US"/>
+        </w:rPr>
+        <w:t xml:space="preserve"> *handle, </w:t>
+      </w:r>
+      <w:proofErr w:type="spellStart"/>
+      <w:r>
+        <w:rPr>
+          <w:lang w:val="en-US"/>
+        </w:rPr>
+        <w:t>DOUT_Pins</w:t>
+      </w:r>
+      <w:proofErr w:type="spellEnd"/>
+      <w:r>
+        <w:rPr>
+          <w:lang w:val="en-US"/>
+        </w:rPr>
+        <w:t xml:space="preserve"> pin, uint8_t level); </w:t>
+      </w:r>
+    </w:p>
+    <w:p>
+      <w:pPr>
+        <w:pStyle w:val="NoSpacing"/>
+        <w:rPr>
+          <w:lang w:val="en-US"/>
+        </w:rPr>
+      </w:pPr>
+    </w:p>
+    <w:p>
+      <w:pPr>
+        <w:pStyle w:val="NoSpacing"/>
+        <w:rPr>
+          <w:lang w:val="en-US"/>
+        </w:rPr>
+      </w:pPr>
+      <w:r>
+        <w:t xml:space="preserve">/* </w:t>
+      </w:r>
+      <w:r>
+        <w:t>Take user requests → update shadow buffer → send full 16-bit frame via SPI → toggle latch → outputs update atomically</w:t>
+      </w:r>
+      <w:r>
+        <w:t xml:space="preserve"> */</w:t>
+      </w:r>
+    </w:p>
+    <w:p>
+      <w:pPr>
+        <w:pStyle w:val="NoSpacing"/>
+        <w:rPr>
+          <w:lang w:val="en-US"/>
+        </w:rPr>
+      </w:pPr>
+      <w:r>
+        <w:rPr>
+          <w:lang w:val="en-US"/>
+        </w:rPr>
+        <w:t xml:space="preserve">void </w:t>
+      </w:r>
+      <w:proofErr w:type="spellStart"/>
+      <w:r>
+        <w:rPr>
+          <w:lang w:val="en-US"/>
+        </w:rPr>
+        <w:t>DIO_updateOutPins</w:t>
+      </w:r>
+      <w:proofErr w:type="spellEnd"/>
+      <w:r>
+        <w:rPr>
+          <w:lang w:val="en-US"/>
+        </w:rPr>
+        <w:t>(</w:t>
+      </w:r>
+      <w:proofErr w:type="spellStart"/>
+      <w:r>
+        <w:rPr>
+          <w:lang w:val="en-US"/>
+        </w:rPr>
+        <w:t>DIO_Handle</w:t>
+      </w:r>
+      <w:proofErr w:type="spellEnd"/>
+      <w:r>
+        <w:rPr>
+          <w:lang w:val="en-US"/>
+        </w:rPr>
+        <w:t xml:space="preserve"> </w:t>
+      </w:r>
+      <w:r>
+        <w:rPr>
+          <w:lang w:val="en-US"/>
+        </w:rPr>
+        <w:t>*</w:t>
+      </w:r>
+      <w:r>
+        <w:rPr>
+          <w:lang w:val="en-US"/>
+        </w:rPr>
+        <w:t xml:space="preserve">handle); </w:t>
+      </w:r>
+    </w:p>
+    <w:p>
+      <w:pPr>
+        <w:pStyle w:val="NoSpacing"/>
+        <w:rPr>
+          <w:lang w:val="en-US"/>
+        </w:rPr>
+      </w:pPr>
+    </w:p>
+    <w:p>
+      <w:pPr>
+        <w:pStyle w:val="NoSpacing"/>
+        <w:rPr>
+          <w:lang w:val="en-US"/>
+        </w:rPr>
+      </w:pPr>
+    </w:p>
+    <w:p>
+      <w:pPr>
+        <w:pStyle w:val="NoSpacing"/>
+        <w:rPr>
+          <w:lang w:val="en-US"/>
+        </w:rPr>
+      </w:pPr>
+      <w:r>
+        <w:t xml:space="preserve">void </w:t>
+      </w:r>
+      <w:proofErr w:type="spellStart"/>
+      <w:r>
+        <w:t>DIO_refreshInputs</w:t>
+      </w:r>
+      <w:proofErr w:type="spellEnd"/>
+      <w:r>
+        <w:t>(</w:t>
+      </w:r>
+      <w:proofErr w:type="spellStart"/>
+      <w:r>
+        <w:t>DIO_Handle</w:t>
+      </w:r>
+      <w:proofErr w:type="spellEnd"/>
+      <w:r>
+        <w:t xml:space="preserve"> *handle); // triggers HW read</w:t>
+      </w:r>
+      <w:r>
+        <w:br/>
+        <w:t xml:space="preserve">uint8_t </w:t>
+      </w:r>
+      <w:proofErr w:type="spellStart"/>
+      <w:r>
+        <w:t>DIO_readPin</w:t>
+      </w:r>
+      <w:proofErr w:type="spellEnd"/>
+      <w:r>
+        <w:t>(</w:t>
+      </w:r>
+      <w:proofErr w:type="spellStart"/>
+      <w:r>
+        <w:t>DIO_Handle</w:t>
+      </w:r>
+      <w:proofErr w:type="spellEnd"/>
+      <w:r>
+        <w:t xml:space="preserve"> *handle, </w:t>
+      </w:r>
+      <w:proofErr w:type="spellStart"/>
+      <w:r>
+        <w:t>DIN_Pins</w:t>
+      </w:r>
+      <w:proofErr w:type="spellEnd"/>
+      <w:r>
+        <w:t xml:space="preserve"> pin);</w:t>
+      </w:r>
+    </w:p>
+    <w:p>
+      <w:pPr>
+        <w:pStyle w:val="NoSpacing"/>
+        <w:rPr>
+          <w:lang w:val="en-US"/>
+        </w:rPr>
+      </w:pPr>
+    </w:p>
+    <w:p>
+      <w:pPr>
+        <w:pStyle w:val="NoSpacing"/>
+        <w:rPr>
+          <w:lang w:val="en-US"/>
+        </w:rPr>
+      </w:pPr>
+      <w:r>
+        <w:rPr>
+          <w:lang w:val="en-US"/>
+        </w:rPr>
+        <w:t>/******************************</w:t>
+      </w:r>
+    </w:p>
+    <w:p>
+      <w:pPr>
+        <w:pStyle w:val="NoSpacing"/>
+        <w:rPr>
+          <w:lang w:val="en-US"/>
+        </w:rPr>
+      </w:pPr>
+      <w:r>
+        <w:rPr>
+          <w:lang w:val="en-US"/>
+        </w:rPr>
+        <w:t xml:space="preserve">* </w:t>
+      </w:r>
+      <w:r>
+        <w:rPr>
+          <w:lang w:val="en-US"/>
+        </w:rPr>
+        <w:t xml:space="preserve">Returns status of an out pin </w:t>
+      </w:r>
+    </w:p>
+    <w:p>
+      <w:pPr>
+        <w:pStyle w:val="NoSpacing"/>
+        <w:rPr>
+          <w:lang w:val="en-US"/>
+        </w:rPr>
+      </w:pPr>
+      <w:r>
+        <w:rPr>
+          <w:lang w:val="en-US"/>
+        </w:rPr>
+        <w:t>******************************/</w:t>
+      </w:r>
+    </w:p>
+    <w:p>
+      <w:pPr>
+        <w:pStyle w:val="NoSpacing"/>
+        <w:rPr>
+          <w:lang w:val="en-US"/>
+        </w:rPr>
+      </w:pPr>
+      <w:r>
+        <w:rPr>
+          <w:lang w:val="en-US"/>
+        </w:rPr>
+        <w:t xml:space="preserve">uint8_t </w:t>
+      </w:r>
+      <w:proofErr w:type="spellStart"/>
+      <w:r>
+        <w:rPr>
+          <w:lang w:val="en-US"/>
+        </w:rPr>
+        <w:t>DIO_getStatusOutPin</w:t>
+      </w:r>
+      <w:proofErr w:type="spellEnd"/>
+      <w:r>
+        <w:rPr>
+          <w:lang w:val="en-US"/>
+        </w:rPr>
+        <w:t>(</w:t>
+      </w:r>
+      <w:proofErr w:type="spellStart"/>
+      <w:r>
+        <w:rPr>
+          <w:lang w:val="en-US"/>
+        </w:rPr>
+        <w:t>DOUT_Pins</w:t>
+      </w:r>
+      <w:proofErr w:type="spellEnd"/>
+      <w:r>
+        <w:rPr>
+          <w:lang w:val="en-US"/>
+        </w:rPr>
+        <w:t xml:space="preserve"> pin);</w:t>
+      </w:r>
+    </w:p>
+    <w:p>
+      <w:pPr>
+        <w:pStyle w:val="NoSpacing"/>
+        <w:rPr>
+          <w:lang w:val="en-US"/>
+        </w:rPr>
+      </w:pPr>
+    </w:p>
+    <w:p>
+      <w:pPr>
+        <w:pStyle w:val="NoSpacing"/>
+        <w:rPr>
+          <w:lang w:val="en-US"/>
+        </w:rPr>
+      </w:pPr>
+    </w:p>
+    <w:p>
+      <w:pPr>
+        <w:pStyle w:val="NoSpacing"/>
+        <w:rPr>
+          <w:lang w:val="en-US"/>
+        </w:rPr>
+      </w:pPr>
+      <w:r>
+        <w:t xml:space="preserve">void </w:t>
+      </w:r>
+      <w:proofErr w:type="spellStart"/>
+      <w:r>
+        <w:t>DIO_writePort</w:t>
+      </w:r>
+      <w:proofErr w:type="spellEnd"/>
+      <w:r>
+        <w:t>(uint16_t value);</w:t>
+      </w:r>
+      <w:r>
+        <w:br/>
         <w:t xml:space="preserve">uint16_t </w:t>
       </w:r>
       <w:proofErr w:type="spellStart"/>
       <w:r>
-        <w:rPr>
-          <w:lang w:val="en-US"/>
-        </w:rPr>
-        <w:t>stateIn</w:t>
+        <w:t>DIO_readPort</w:t>
       </w:r>
       <w:proofErr w:type="spellEnd"/>
       <w:r>
-        <w:rPr>
-          <w:lang w:val="en-US"/>
-        </w:rPr>
-        <w:t xml:space="preserve">; // Holds previous state of input pins </w:t>
-      </w:r>
-    </w:p>
-    <w:p>
-      <w:pPr>
-        <w:pStyle w:val="NoSpacing"/>
-        <w:rPr>
-          <w:lang w:val="en-US"/>
-        </w:rPr>
-      </w:pPr>
-      <w:r>
-        <w:rPr>
-          <w:lang w:val="en-US"/>
-        </w:rPr>
-        <w:t xml:space="preserve">uint16_t </w:t>
-      </w:r>
-      <w:proofErr w:type="spellStart"/>
-      <w:r>
-        <w:rPr>
-          <w:lang w:val="en-US"/>
-        </w:rPr>
-        <w:t>stateOut</w:t>
-      </w:r>
-      <w:proofErr w:type="spellEnd"/>
-      <w:r>
-        <w:rPr>
-          <w:lang w:val="en-US"/>
-        </w:rPr>
-        <w:t>; // Holds previous state of output pins</w:t>
-      </w:r>
-    </w:p>
-    <w:p>
-      <w:pPr>
-        <w:pStyle w:val="NoSpacing"/>
-        <w:rPr>
-          <w:lang w:val="en-US"/>
-        </w:rPr>
-      </w:pPr>
-      <w:r>
-        <w:rPr>
-          <w:lang w:val="en-US"/>
-        </w:rPr>
-        <w:t>}</w:t>
-      </w:r>
-    </w:p>
-    <w:p>
-      <w:pPr>
-        <w:pStyle w:val="NoSpacing"/>
-        <w:rPr>
-          <w:lang w:val="en-US"/>
-        </w:rPr>
-      </w:pPr>
-    </w:p>
-    <w:p>
-      <w:pPr>
-        <w:pStyle w:val="Heading1"/>
-        <w:rPr>
-          <w:lang w:val="en-US"/>
-        </w:rPr>
-      </w:pPr>
-      <w:r>
-        <w:rPr>
-          <w:lang w:val="en-US"/>
-        </w:rPr>
-        <w:t>APIs</w:t>
-      </w:r>
-    </w:p>
-    <w:p>
-      <w:pPr>
-        <w:pStyle w:val="NoSpacing"/>
-        <w:rPr>
-          <w:lang w:val="en-US"/>
-        </w:rPr>
-      </w:pPr>
-      <w:r>
-        <w:rPr>
-          <w:lang w:val="en-US"/>
-        </w:rPr>
-        <w:t>/******************************</w:t>
-      </w:r>
-    </w:p>
-    <w:p>
-      <w:pPr>
-        <w:pStyle w:val="NoSpacing"/>
-        <w:rPr>
-          <w:lang w:val="en-US"/>
-        </w:rPr>
-      </w:pPr>
-      <w:r>
-        <w:rPr>
-          <w:lang w:val="en-US"/>
-        </w:rPr>
-        <w:t xml:space="preserve">* </w:t>
-      </w:r>
-      <w:proofErr w:type="gramStart"/>
-      <w:r>
-        <w:rPr>
-          <w:lang w:val="en-US"/>
-        </w:rPr>
-        <w:t>initializes</w:t>
-      </w:r>
-      <w:proofErr w:type="gramEnd"/>
-      <w:r>
-        <w:rPr>
-          <w:lang w:val="en-US"/>
-        </w:rPr>
-        <w:t xml:space="preserve"> connections and returns handle with default values of handle arguments</w:t>
-      </w:r>
-    </w:p>
-    <w:p>
-      <w:pPr>
-        <w:pStyle w:val="NoSpacing"/>
-        <w:rPr>
-          <w:lang w:val="en-US"/>
-        </w:rPr>
-      </w:pPr>
-      <w:r>
-        <w:rPr>
-          <w:lang w:val="en-US"/>
-        </w:rPr>
-        <w:t>******************************/</w:t>
-      </w:r>
-    </w:p>
-    <w:p>
-      <w:pPr>
-        <w:pStyle w:val="NoSpacing"/>
-        <w:rPr>
-          <w:lang w:val="en-US"/>
-        </w:rPr>
-      </w:pPr>
-      <w:proofErr w:type="spellStart"/>
-      <w:r>
-        <w:rPr>
-          <w:lang w:val="en-US"/>
-        </w:rPr>
-        <w:t>DIO_Handle</w:t>
-      </w:r>
-      <w:proofErr w:type="spellEnd"/>
-      <w:r>
-        <w:rPr>
-          <w:lang w:val="en-US"/>
-        </w:rPr>
-        <w:t xml:space="preserve"> </w:t>
-      </w:r>
-      <w:proofErr w:type="spellStart"/>
-      <w:r>
-        <w:rPr>
-          <w:lang w:val="en-US"/>
-        </w:rPr>
-        <w:t>DIO_init</w:t>
-      </w:r>
-      <w:proofErr w:type="spellEnd"/>
-      <w:r>
-        <w:rPr>
-          <w:lang w:val="en-US"/>
-        </w:rPr>
-        <w:t>(void)</w:t>
-      </w:r>
-    </w:p>
-    <w:p>
-      <w:pPr>
-        <w:pStyle w:val="NoSpacing"/>
-        <w:rPr>
-          <w:lang w:val="en-US"/>
-        </w:rPr>
-      </w:pPr>
-    </w:p>
-    <w:p>
-      <w:pPr>
-        <w:pStyle w:val="NoSpacing"/>
-        <w:rPr>
-          <w:lang w:val="en-US"/>
-        </w:rPr>
-      </w:pPr>
-    </w:p>
-    <w:p>
-      <w:pPr>
-        <w:pStyle w:val="NoSpacing"/>
-        <w:rPr>
-          <w:lang w:val="en-US"/>
-        </w:rPr>
-      </w:pPr>
-      <w:r>
-        <w:rPr>
-          <w:lang w:val="en-US"/>
-        </w:rPr>
-        <w:t>/******************************</w:t>
-      </w:r>
-    </w:p>
-    <w:p>
-      <w:pPr>
-        <w:pStyle w:val="NoSpacing"/>
-        <w:rPr>
-          <w:lang w:val="en-US"/>
-        </w:rPr>
-      </w:pPr>
-      <w:r>
-        <w:rPr>
-          <w:lang w:val="en-US"/>
-        </w:rPr>
-        <w:t xml:space="preserve">* </w:t>
-      </w:r>
-      <w:r>
-        <w:rPr>
-          <w:lang w:val="en-US"/>
-        </w:rPr>
-        <w:t>Collects intended level of an out pin</w:t>
-      </w:r>
-    </w:p>
-    <w:p>
-      <w:pPr>
-        <w:pStyle w:val="NoSpacing"/>
-        <w:rPr>
-          <w:lang w:val="en-US"/>
-        </w:rPr>
-      </w:pPr>
-      <w:r>
-        <w:rPr>
-          <w:lang w:val="en-US"/>
-        </w:rPr>
-        <w:t>******************************/</w:t>
-      </w:r>
-    </w:p>
-    <w:p>
-      <w:pPr>
-        <w:pStyle w:val="NoSpacing"/>
-        <w:rPr>
-          <w:lang w:val="en-US"/>
-        </w:rPr>
-      </w:pPr>
-      <w:r>
-        <w:rPr>
-          <w:lang w:val="en-US"/>
-        </w:rPr>
-        <w:t xml:space="preserve">void </w:t>
-      </w:r>
-      <w:proofErr w:type="spellStart"/>
-      <w:r>
-        <w:rPr>
-          <w:lang w:val="en-US"/>
-        </w:rPr>
-        <w:t>DIO_</w:t>
-      </w:r>
-      <w:proofErr w:type="gramStart"/>
-      <w:r>
-        <w:rPr>
-          <w:lang w:val="en-US"/>
-        </w:rPr>
-        <w:t>writePin</w:t>
-      </w:r>
-      <w:proofErr w:type="spellEnd"/>
-      <w:r>
-        <w:rPr>
-          <w:lang w:val="en-US"/>
-        </w:rPr>
-        <w:t>(</w:t>
-      </w:r>
-      <w:proofErr w:type="spellStart"/>
-      <w:proofErr w:type="gramEnd"/>
-      <w:r>
-        <w:rPr>
-          <w:lang w:val="en-US"/>
-        </w:rPr>
-        <w:t>DOUT_Pins</w:t>
-      </w:r>
-      <w:proofErr w:type="spellEnd"/>
-      <w:r>
-        <w:rPr>
-          <w:lang w:val="en-US"/>
-        </w:rPr>
-        <w:t xml:space="preserve"> pin, </w:t>
-      </w:r>
-      <w:proofErr w:type="spellStart"/>
-      <w:r>
-        <w:rPr>
-          <w:lang w:val="en-US"/>
-        </w:rPr>
-        <w:t>DIO_Handle</w:t>
-      </w:r>
-      <w:proofErr w:type="spellEnd"/>
-      <w:r>
-        <w:rPr>
-          <w:lang w:val="en-US"/>
-        </w:rPr>
-        <w:t xml:space="preserve"> handle, uint8_t level); </w:t>
-      </w:r>
-    </w:p>
-    <w:p>
-      <w:pPr>
-        <w:pStyle w:val="NoSpacing"/>
-        <w:rPr>
-          <w:lang w:val="en-US"/>
-        </w:rPr>
-      </w:pPr>
-    </w:p>
-    <w:p>
-      <w:pPr>
-        <w:pStyle w:val="NoSpacing"/>
-        <w:rPr>
-          <w:lang w:val="en-US"/>
-        </w:rPr>
-      </w:pPr>
-    </w:p>
-    <w:p>
-      <w:pPr>
-        <w:pStyle w:val="NoSpacing"/>
-        <w:rPr>
-          <w:lang w:val="en-US"/>
-        </w:rPr>
-      </w:pPr>
-      <w:r>
-        <w:rPr>
-          <w:lang w:val="en-US"/>
-        </w:rPr>
-        <w:t>/******************************</w:t>
-      </w:r>
-    </w:p>
-    <w:p>
-      <w:pPr>
-        <w:pStyle w:val="NoSpacing"/>
-        <w:rPr>
-          <w:lang w:val="en-US"/>
-        </w:rPr>
-      </w:pPr>
-      <w:r>
-        <w:rPr>
-          <w:lang w:val="en-US"/>
-        </w:rPr>
-        <w:t xml:space="preserve">* </w:t>
-      </w:r>
-      <w:r>
-        <w:rPr>
-          <w:lang w:val="en-US"/>
-        </w:rPr>
-        <w:t>Sets all Output pins to the requested level</w:t>
-      </w:r>
-    </w:p>
-    <w:p>
-      <w:pPr>
-        <w:pStyle w:val="NoSpacing"/>
-        <w:rPr>
-          <w:lang w:val="en-US"/>
-        </w:rPr>
-      </w:pPr>
-      <w:r>
-        <w:rPr>
-          <w:lang w:val="en-US"/>
-        </w:rPr>
-        <w:t xml:space="preserve">* To be called after </w:t>
-      </w:r>
-      <w:proofErr w:type="spellStart"/>
-      <w:r>
-        <w:rPr>
-          <w:lang w:val="en-US"/>
-        </w:rPr>
-        <w:t>DIO_</w:t>
-      </w:r>
-      <w:proofErr w:type="gramStart"/>
-      <w:r>
-        <w:rPr>
-          <w:lang w:val="en-US"/>
-        </w:rPr>
-        <w:t>writePin</w:t>
-      </w:r>
-      <w:proofErr w:type="spellEnd"/>
-      <w:r>
-        <w:rPr>
-          <w:lang w:val="en-US"/>
-        </w:rPr>
-        <w:t>(</w:t>
-      </w:r>
-      <w:proofErr w:type="gramEnd"/>
-      <w:r>
-        <w:rPr>
-          <w:lang w:val="en-US"/>
-        </w:rPr>
-        <w:t>) to see any changes at out pins</w:t>
-      </w:r>
-    </w:p>
-    <w:p>
-      <w:pPr>
-        <w:pStyle w:val="NoSpacing"/>
-        <w:rPr>
-          <w:lang w:val="en-US"/>
-        </w:rPr>
-      </w:pPr>
-      <w:r>
-        <w:rPr>
-          <w:lang w:val="en-US"/>
-        </w:rPr>
-        <w:t>******************************/</w:t>
-      </w:r>
-    </w:p>
-    <w:p>
-      <w:pPr>
-        <w:pStyle w:val="NoSpacing"/>
-        <w:rPr>
-          <w:lang w:val="en-US"/>
-        </w:rPr>
-      </w:pPr>
-      <w:r>
-        <w:rPr>
-          <w:lang w:val="en-US"/>
-        </w:rPr>
-        <w:t xml:space="preserve">void </w:t>
-      </w:r>
-      <w:proofErr w:type="spellStart"/>
-      <w:r>
-        <w:rPr>
-          <w:lang w:val="en-US"/>
-        </w:rPr>
-        <w:t>DIO_</w:t>
-      </w:r>
-      <w:proofErr w:type="gramStart"/>
-      <w:r>
-        <w:rPr>
-          <w:lang w:val="en-US"/>
-        </w:rPr>
-        <w:t>updateOutPins</w:t>
-      </w:r>
-      <w:proofErr w:type="spellEnd"/>
-      <w:r>
-        <w:rPr>
-          <w:lang w:val="en-US"/>
-        </w:rPr>
-        <w:t>(</w:t>
-      </w:r>
-      <w:proofErr w:type="spellStart"/>
-      <w:proofErr w:type="gramEnd"/>
-      <w:r>
-        <w:rPr>
-          <w:lang w:val="en-US"/>
-        </w:rPr>
-        <w:t>DIO_Handle</w:t>
-      </w:r>
-      <w:proofErr w:type="spellEnd"/>
-      <w:r>
-        <w:rPr>
-          <w:lang w:val="en-US"/>
-        </w:rPr>
-        <w:t xml:space="preserve"> handle); </w:t>
-      </w:r>
-    </w:p>
-    <w:p>
-      <w:pPr>
-        <w:pStyle w:val="NoSpacing"/>
-        <w:rPr>
-          <w:lang w:val="en-US"/>
-        </w:rPr>
-      </w:pPr>
-    </w:p>
-    <w:p>
-      <w:pPr>
-        <w:pStyle w:val="NoSpacing"/>
-        <w:rPr>
-          <w:lang w:val="en-US"/>
-        </w:rPr>
-      </w:pPr>
-    </w:p>
-    <w:p>
-      <w:pPr>
-        <w:pStyle w:val="NoSpacing"/>
-        <w:rPr>
-          <w:lang w:val="en-US"/>
-        </w:rPr>
-      </w:pPr>
-      <w:r>
-        <w:rPr>
-          <w:lang w:val="en-US"/>
-        </w:rPr>
-        <w:t>/******************************</w:t>
-      </w:r>
-    </w:p>
-    <w:p>
-      <w:pPr>
-        <w:pStyle w:val="NoSpacing"/>
-        <w:rPr>
-          <w:lang w:val="en-US"/>
-        </w:rPr>
-      </w:pPr>
-      <w:r>
-        <w:rPr>
-          <w:lang w:val="en-US"/>
-        </w:rPr>
-        <w:t xml:space="preserve">* Collects </w:t>
-      </w:r>
-      <w:r>
-        <w:rPr>
-          <w:lang w:val="en-US"/>
-        </w:rPr>
-        <w:t>actual</w:t>
-      </w:r>
-      <w:r>
-        <w:rPr>
-          <w:lang w:val="en-US"/>
-        </w:rPr>
-        <w:t xml:space="preserve"> level of an </w:t>
-      </w:r>
-      <w:proofErr w:type="gramStart"/>
-      <w:r>
-        <w:rPr>
-          <w:lang w:val="en-US"/>
-        </w:rPr>
-        <w:t>In</w:t>
-      </w:r>
-      <w:proofErr w:type="gramEnd"/>
-      <w:r>
-        <w:rPr>
-          <w:lang w:val="en-US"/>
-        </w:rPr>
-        <w:t xml:space="preserve"> pin</w:t>
-      </w:r>
-    </w:p>
-    <w:p>
-      <w:pPr>
-        <w:pStyle w:val="NoSpacing"/>
-        <w:rPr>
-          <w:lang w:val="en-US"/>
-        </w:rPr>
-      </w:pPr>
-      <w:r>
-        <w:rPr>
-          <w:lang w:val="en-US"/>
-        </w:rPr>
-        <w:t>******************************/</w:t>
-      </w:r>
-    </w:p>
-    <w:p>
-      <w:pPr>
-        <w:pStyle w:val="NoSpacing"/>
-        <w:rPr>
-          <w:lang w:val="en-US"/>
-        </w:rPr>
-      </w:pPr>
-      <w:r>
-        <w:rPr>
-          <w:lang w:val="en-US"/>
-        </w:rPr>
-        <w:t xml:space="preserve">void </w:t>
-      </w:r>
-      <w:proofErr w:type="spellStart"/>
-      <w:r>
-        <w:rPr>
-          <w:lang w:val="en-US"/>
-        </w:rPr>
-        <w:t>DIO_</w:t>
-      </w:r>
-      <w:proofErr w:type="gramStart"/>
-      <w:r>
-        <w:rPr>
-          <w:lang w:val="en-US"/>
-        </w:rPr>
-        <w:t>read</w:t>
-      </w:r>
-      <w:r>
-        <w:rPr>
-          <w:lang w:val="en-US"/>
-        </w:rPr>
-        <w:t>Pin</w:t>
-      </w:r>
-      <w:proofErr w:type="spellEnd"/>
-      <w:r>
-        <w:rPr>
-          <w:lang w:val="en-US"/>
-        </w:rPr>
-        <w:t>(</w:t>
-      </w:r>
-      <w:proofErr w:type="spellStart"/>
-      <w:proofErr w:type="gramEnd"/>
-      <w:r>
-        <w:rPr>
-          <w:lang w:val="en-US"/>
-        </w:rPr>
-        <w:t>D</w:t>
-      </w:r>
-      <w:r>
-        <w:rPr>
-          <w:lang w:val="en-US"/>
-        </w:rPr>
-        <w:t>IN</w:t>
-      </w:r>
-      <w:r>
-        <w:rPr>
-          <w:lang w:val="en-US"/>
-        </w:rPr>
-        <w:t>_Pins</w:t>
-      </w:r>
-      <w:proofErr w:type="spellEnd"/>
-      <w:r>
-        <w:rPr>
-          <w:lang w:val="en-US"/>
-        </w:rPr>
-        <w:t xml:space="preserve"> pin, </w:t>
-      </w:r>
-      <w:proofErr w:type="spellStart"/>
-      <w:r>
-        <w:rPr>
-          <w:lang w:val="en-US"/>
-        </w:rPr>
-        <w:t>DIO_Handle</w:t>
-      </w:r>
-      <w:proofErr w:type="spellEnd"/>
-      <w:r>
-        <w:rPr>
-          <w:lang w:val="en-US"/>
-        </w:rPr>
-        <w:t xml:space="preserve"> handle); </w:t>
-      </w:r>
-    </w:p>
-    <w:p>
-      <w:pPr>
-        <w:pStyle w:val="NoSpacing"/>
-        <w:rPr>
-          <w:lang w:val="en-US"/>
-        </w:rPr>
-      </w:pPr>
-    </w:p>
-    <w:p>
-      <w:pPr>
-        <w:pStyle w:val="NoSpacing"/>
-        <w:rPr>
-          <w:lang w:val="en-US"/>
-        </w:rPr>
-      </w:pPr>
-    </w:p>
-    <w:p>
-      <w:pPr>
-        <w:pStyle w:val="NoSpacing"/>
-        <w:rPr>
-          <w:lang w:val="en-US"/>
-        </w:rPr>
-      </w:pPr>
-      <w:r>
-        <w:rPr>
-          <w:lang w:val="en-US"/>
-        </w:rPr>
-        <w:t>/******************************</w:t>
-      </w:r>
-    </w:p>
-    <w:p>
-      <w:pPr>
-        <w:pStyle w:val="NoSpacing"/>
-        <w:rPr>
-          <w:lang w:val="en-US"/>
-        </w:rPr>
-      </w:pPr>
-      <w:r>
-        <w:rPr>
-          <w:lang w:val="en-US"/>
-        </w:rPr>
-        <w:t xml:space="preserve">* </w:t>
-      </w:r>
-      <w:r>
-        <w:rPr>
-          <w:lang w:val="en-US"/>
-        </w:rPr>
-        <w:t xml:space="preserve">Returns status of an out pin </w:t>
-      </w:r>
-    </w:p>
-    <w:p>
-      <w:pPr>
-        <w:pStyle w:val="NoSpacing"/>
-        <w:rPr>
-          <w:lang w:val="en-US"/>
-        </w:rPr>
-      </w:pPr>
-      <w:r>
-        <w:rPr>
-          <w:lang w:val="en-US"/>
-        </w:rPr>
-        <w:t>******************************/</w:t>
-      </w:r>
-    </w:p>
-    <w:p>
-      <w:pPr>
-        <w:pStyle w:val="NoSpacing"/>
-        <w:rPr>
-          <w:lang w:val="en-US"/>
-        </w:rPr>
-      </w:pPr>
-      <w:r>
-        <w:rPr>
-          <w:lang w:val="en-US"/>
-        </w:rPr>
-        <w:t xml:space="preserve">uint8_t </w:t>
-      </w:r>
-      <w:proofErr w:type="spellStart"/>
-      <w:r>
-        <w:rPr>
-          <w:lang w:val="en-US"/>
-        </w:rPr>
-        <w:t>DIO_</w:t>
-      </w:r>
-      <w:proofErr w:type="gramStart"/>
-      <w:r>
-        <w:rPr>
-          <w:lang w:val="en-US"/>
-        </w:rPr>
-        <w:t>getStatusOutPin</w:t>
-      </w:r>
-      <w:proofErr w:type="spellEnd"/>
-      <w:r>
-        <w:rPr>
-          <w:lang w:val="en-US"/>
-        </w:rPr>
-        <w:t>(</w:t>
-      </w:r>
-      <w:proofErr w:type="spellStart"/>
-      <w:proofErr w:type="gramEnd"/>
-      <w:r>
-        <w:rPr>
-          <w:lang w:val="en-US"/>
-        </w:rPr>
-        <w:t>DOUT_Pins</w:t>
-      </w:r>
-      <w:proofErr w:type="spellEnd"/>
-      <w:r>
-        <w:rPr>
-          <w:lang w:val="en-US"/>
-        </w:rPr>
-        <w:t xml:space="preserve"> pin);</w:t>
-      </w:r>
-    </w:p>
-    <w:p>
-      <w:pPr>
-        <w:pStyle w:val="NoSpacing"/>
-        <w:rPr>
-          <w:lang w:val="en-US"/>
-        </w:rPr>
-      </w:pPr>
-    </w:p>
-    <w:p>
-      <w:pPr>
-        <w:pStyle w:val="NoSpacing"/>
-        <w:rPr>
-          <w:lang w:val="en-US"/>
-        </w:rPr>
-      </w:pPr>
-    </w:p>
-    <w:p>
-      <w:pPr>
-        <w:pStyle w:val="NoSpacing"/>
-        <w:rPr>
-          <w:lang w:val="en-US"/>
-        </w:rPr>
-      </w:pPr>
-    </w:p>
-    <w:p>
-      <w:pPr>
-        <w:pStyle w:val="NoSpacing"/>
-        <w:rPr>
-          <w:lang w:val="en-US"/>
-        </w:rPr>
-      </w:pPr>
-    </w:p>
-    <w:p>
-      <w:pPr>
-        <w:pStyle w:val="NoSpacing"/>
-        <w:rPr>
-          <w:lang w:val="en-US"/>
-        </w:rPr>
-      </w:pPr>
+        <w:t>(void);</w:t>
+      </w:r>
     </w:p>
     <w:sectPr>
       <w:pgSz w:w="11906" w:h="16838"/>
@@ -2553,7 +2595,6 @@
   <w:style w:type="character" w:default="1" w:styleId="DefaultParagraphFont">
     <w:name w:val="Default Paragraph Font"/>
     <w:uiPriority w:val="1"/>
-    <w:semiHidden/>
     <w:unhideWhenUsed/>
   </w:style>
   <w:style w:type="table" w:default="1" w:styleId="TableNormal">

</xml_diff>